<commit_message>
preliminar terminado DESAFIO 1.docx
Signed-off-by: JUAN20 <sebastian.cuello@udea.edu.co>
</commit_message>
<xml_diff>
--- a/DESAFIO 1.docx
+++ b/DESAFIO 1.docx
@@ -334,14 +334,12 @@
         </w:rPr>
         <w:t xml:space="preserve">Este informe contiene la esencia básica de cómo voy a abordar la solución al desafío 1, Contextualizando el </w:t>
       </w:r>
-      <w:proofErr w:type="gramStart"/>
-      <w:r>
-        <w:rPr>
-          <w:lang w:val="es-ES"/>
-        </w:rPr>
-        <w:t>problema,  dando</w:t>
-      </w:r>
-      <w:proofErr w:type="gramEnd"/>
+      <w:r>
+        <w:rPr>
+          <w:lang w:val="es-ES"/>
+        </w:rPr>
+        <w:t>problema, dando</w:t>
+      </w:r>
       <w:r>
         <w:rPr>
           <w:lang w:val="es-ES"/>
@@ -1108,7 +1106,25 @@
         <w:rPr>
           <w:lang w:val="es-ES"/>
         </w:rPr>
-        <w:t xml:space="preserve">Dado que el ancho del tablero debe ser múltiplo de 8, decidí representar cada fila del tablero mediante un arreglo de bytes donde cada byte almacena 8 celdas del tablero. En que me ayuda esto en la optimización de memoria y facilita el uso de máscaras, desplazamientos y comparaciones bitwise. </w:t>
+        <w:t xml:space="preserve">Dado que el ancho del tablero debe ser múltiplo de 8, </w:t>
+      </w:r>
+      <w:r>
+        <w:rPr>
+          <w:lang w:val="es-ES"/>
+        </w:rPr>
+        <w:t>es conveniente</w:t>
+      </w:r>
+      <w:r>
+        <w:rPr>
+          <w:lang w:val="es-ES"/>
+        </w:rPr>
+        <w:t xml:space="preserve"> representar </w:t>
+      </w:r>
+      <w:r>
+        <w:rPr>
+          <w:lang w:val="es-ES"/>
+        </w:rPr>
+        <w:t>fila por bytes optimizando memoria y facilitando máscaras, desplazamiento y comparaciones bitwise</w:t>
       </w:r>
     </w:p>
     <w:p>
@@ -1146,7 +1162,13 @@
         <w:rPr>
           <w:lang w:val="es-ES"/>
         </w:rPr>
-        <w:t xml:space="preserve">Ya que el tablero no puede tener un tamaño fijo, por que sus dimensiones se definen al iniciar el juego, para eso decidí plantear una estructura dinámica de filas y bytes reservados en tiempo de ejecución. </w:t>
+        <w:t xml:space="preserve">Ya que el tablero no puede tener un tamaño fijo, por que sus dimensiones se definen al iniciar </w:t>
+      </w:r>
+      <w:r>
+        <w:rPr>
+          <w:lang w:val="es-ES"/>
+        </w:rPr>
+        <w:t xml:space="preserve">teniendo un alto y un ancho, para eso es necesario utilizar memoria dinámica </w:t>
       </w:r>
     </w:p>
     <w:p>
@@ -1186,14 +1208,12 @@
         </w:rPr>
         <w:t xml:space="preserve">Cada pieza se modela en una caja local de 4x4, ya que </w:t>
       </w:r>
-      <w:proofErr w:type="gramStart"/>
-      <w:r>
-        <w:rPr>
-          <w:lang w:val="es-ES"/>
-        </w:rPr>
-        <w:t>todas la piezas</w:t>
-      </w:r>
-      <w:proofErr w:type="gramEnd"/>
+      <w:r>
+        <w:rPr>
+          <w:lang w:val="es-ES"/>
+        </w:rPr>
+        <w:t>todas las piezas</w:t>
+      </w:r>
       <w:r>
         <w:rPr>
           <w:lang w:val="es-ES"/>
@@ -1223,21 +1243,21 @@
         <w:rPr>
           <w:lang w:val="es-ES"/>
         </w:rPr>
+        <w:t xml:space="preserve">Separación entre pieza activa y tablero fijo. </w:t>
+      </w:r>
+    </w:p>
+    <w:p>
+      <w:pPr>
+        <w:ind w:left="360"/>
+        <w:rPr>
+          <w:lang w:val="es-ES"/>
+        </w:rPr>
+      </w:pPr>
+      <w:r>
+        <w:rPr>
+          <w:lang w:val="es-ES"/>
+        </w:rPr>
         <w:lastRenderedPageBreak/>
-        <w:t xml:space="preserve">Separación entre pieza activa y tablero fijo. </w:t>
-      </w:r>
-    </w:p>
-    <w:p>
-      <w:pPr>
-        <w:ind w:left="360"/>
-        <w:rPr>
-          <w:lang w:val="es-ES"/>
-        </w:rPr>
-      </w:pPr>
-      <w:r>
-        <w:rPr>
-          <w:lang w:val="es-ES"/>
-        </w:rPr>
         <w:t xml:space="preserve">Ya que la pieza activa no debe formar parte permanente del tablero mientras se mueve. Debe manejarse como una entidad independiente con tipo, rotación y posición. </w:t>
       </w:r>
     </w:p>
@@ -1278,8 +1298,600 @@
         <w:rPr>
           <w:lang w:val="es-ES"/>
         </w:rPr>
-        <w:t xml:space="preserve">Antes de aplicar un movimiento o rotación, se verifica de forma tentativa si la nueva configuración es valida </w:t>
-      </w:r>
+        <w:t xml:space="preserve">Antes de aplicar un movimiento o rotación, se verifica de forma tentativa si la nueva configuración es </w:t>
+      </w:r>
+      <w:proofErr w:type="spellStart"/>
+      <w:r>
+        <w:rPr>
+          <w:lang w:val="es-ES"/>
+        </w:rPr>
+        <w:t>valida</w:t>
+      </w:r>
+      <w:proofErr w:type="spellEnd"/>
+      <w:r>
+        <w:rPr>
+          <w:lang w:val="es-ES"/>
+        </w:rPr>
+        <w:t>.</w:t>
+      </w:r>
+    </w:p>
+    <w:p>
+      <w:pPr>
+        <w:ind w:left="360"/>
+        <w:rPr>
+          <w:lang w:val="es-ES"/>
+        </w:rPr>
+      </w:pPr>
+    </w:p>
+    <w:p>
+      <w:pPr>
+        <w:pStyle w:val="Prrafodelista"/>
+        <w:numPr>
+          <w:ilvl w:val="1"/>
+          <w:numId w:val="1"/>
+        </w:numPr>
+        <w:rPr>
+          <w:lang w:val="es-ES"/>
+        </w:rPr>
+      </w:pPr>
+      <w:r>
+        <w:rPr>
+          <w:lang w:val="es-ES"/>
+        </w:rPr>
+        <w:t xml:space="preserve">Rotaciones predefinidas. </w:t>
+      </w:r>
+    </w:p>
+    <w:p>
+      <w:pPr>
+        <w:ind w:left="360"/>
+        <w:rPr>
+          <w:lang w:val="es-ES"/>
+        </w:rPr>
+      </w:pPr>
+      <w:r>
+        <w:rPr>
+          <w:lang w:val="es-ES"/>
+        </w:rPr>
+        <w:t>Para importante para dar soluciones a esta parte del problema, no es calcular cada rotación de una pieza desde cero durante la ejecución, si no trabajar con orientaciones previamente definas. Este enfoque me resulta conveniente por que ayuda a reducir la lógica, facilita la validación de movimientos y reduce los errores en el manejo geométrico de las piezas. Este desafío exige que las piezas sigan patrones de rotación y que su representación se base en bits, almacenar la</w:t>
+      </w:r>
+      <w:r>
+        <w:rPr>
+          <w:lang w:val="es-ES"/>
+        </w:rPr>
+        <w:t>s</w:t>
+      </w:r>
+      <w:r>
+        <w:rPr>
+          <w:lang w:val="es-ES"/>
+        </w:rPr>
+        <w:t xml:space="preserve"> rotaciones de forma predefina mantiene coherencia con la estructura del sistema.</w:t>
+      </w:r>
+    </w:p>
+    <w:p>
+      <w:pPr>
+        <w:pStyle w:val="Prrafodelista"/>
+        <w:numPr>
+          <w:ilvl w:val="1"/>
+          <w:numId w:val="1"/>
+        </w:numPr>
+        <w:rPr>
+          <w:lang w:val="es-ES"/>
+        </w:rPr>
+      </w:pPr>
+      <w:r>
+        <w:rPr>
+          <w:lang w:val="es-ES"/>
+        </w:rPr>
+        <w:t>Generación uniforme de piezas.</w:t>
+      </w:r>
+    </w:p>
+    <w:p>
+      <w:pPr>
+        <w:ind w:left="360"/>
+        <w:rPr>
+          <w:lang w:val="es-ES"/>
+        </w:rPr>
+      </w:pPr>
+      <w:r>
+        <w:rPr>
+          <w:lang w:val="es-ES"/>
+        </w:rPr>
+        <w:t xml:space="preserve">La aparición de nuevas piezas no debe realizarse de forma arbitraria, si no bajo un criterio de aleatoriedad. Significa que cada pieza definida debe tener la misma probabilidad de ser seleccionada al momento de correr el juego o de generar una nueva pieza después de la fijación anterior.  Creo que es una buena estrategia de selección que trata a todas las piezas de manera equilibrada. </w:t>
+      </w:r>
+    </w:p>
+    <w:p>
+      <w:pPr>
+        <w:ind w:left="360"/>
+        <w:rPr>
+          <w:lang w:val="es-ES"/>
+        </w:rPr>
+      </w:pPr>
+    </w:p>
+    <w:p>
+      <w:pPr>
+        <w:pStyle w:val="Prrafodelista"/>
+        <w:numPr>
+          <w:ilvl w:val="1"/>
+          <w:numId w:val="1"/>
+        </w:numPr>
+        <w:rPr>
+          <w:lang w:val="es-ES"/>
+        </w:rPr>
+      </w:pPr>
+      <w:r>
+        <w:rPr>
+          <w:lang w:val="es-ES"/>
+        </w:rPr>
+        <w:t xml:space="preserve">Ubicación inicial centrada de la pieza. </w:t>
+      </w:r>
+    </w:p>
+    <w:p>
+      <w:pPr>
+        <w:ind w:left="360"/>
+        <w:rPr>
+          <w:lang w:val="es-ES"/>
+        </w:rPr>
+      </w:pPr>
+      <w:r>
+        <w:rPr>
+          <w:lang w:val="es-ES"/>
+        </w:rPr>
+        <w:t xml:space="preserve">Otra consideración es que cada pieza debe aparecer en la zona superior y centrada respecto al ancho del tablero. Esta decisión no solo responde a una exigencia explicita del desafío, sino que también aporta coherencia al flujo del juego, esto evita posiciones arbitrarias. Plantear una posición inicial centrada también simplifica la organización del turno y hace mas claro el proceso de validación inicial.  </w:t>
+      </w:r>
+    </w:p>
+    <w:p>
+      <w:pPr>
+        <w:rPr>
+          <w:lang w:val="es-ES"/>
+        </w:rPr>
+      </w:pPr>
+      <w:r>
+        <w:rPr>
+          <w:lang w:val="es-ES"/>
+        </w:rPr>
+        <w:t xml:space="preserve">    </w:t>
+      </w:r>
+    </w:p>
+    <w:p>
+      <w:pPr>
+        <w:rPr>
+          <w:lang w:val="es-ES"/>
+        </w:rPr>
+      </w:pPr>
+    </w:p>
+    <w:p>
+      <w:pPr>
+        <w:pStyle w:val="Prrafodelista"/>
+        <w:numPr>
+          <w:ilvl w:val="1"/>
+          <w:numId w:val="1"/>
+        </w:numPr>
+        <w:rPr>
+          <w:lang w:val="es-ES"/>
+        </w:rPr>
+      </w:pPr>
+      <w:r>
+        <w:rPr>
+          <w:lang w:val="es-ES"/>
+        </w:rPr>
+        <w:t xml:space="preserve">Flujo del juego basado en turnos. </w:t>
+      </w:r>
+    </w:p>
+    <w:p>
+      <w:pPr>
+        <w:ind w:left="360"/>
+        <w:rPr>
+          <w:lang w:val="es-ES"/>
+        </w:rPr>
+      </w:pPr>
+      <w:r>
+        <w:rPr>
+          <w:lang w:val="es-ES"/>
+        </w:rPr>
+        <w:t xml:space="preserve">La solución se diseñará bajo un flujo discreto por estados, no bajo animación continua. Eso justifica por que que el sistema imprimirá el tablero cuando cambie el estado. </w:t>
+      </w:r>
+    </w:p>
+    <w:p>
+      <w:pPr>
+        <w:ind w:left="360"/>
+        <w:rPr>
+          <w:lang w:val="es-ES"/>
+        </w:rPr>
+      </w:pPr>
+    </w:p>
+    <w:p>
+      <w:pPr>
+        <w:pStyle w:val="Prrafodelista"/>
+        <w:numPr>
+          <w:ilvl w:val="1"/>
+          <w:numId w:val="1"/>
+        </w:numPr>
+        <w:rPr>
+          <w:lang w:val="es-ES"/>
+        </w:rPr>
+      </w:pPr>
+      <w:r>
+        <w:rPr>
+          <w:lang w:val="es-ES"/>
+        </w:rPr>
+        <w:t xml:space="preserve">Reutilización de una misma lógica de validación. </w:t>
+      </w:r>
+    </w:p>
+    <w:p>
+      <w:pPr>
+        <w:ind w:left="360"/>
+        <w:rPr>
+          <w:lang w:val="es-ES"/>
+        </w:rPr>
+      </w:pPr>
+      <w:r>
+        <w:rPr>
+          <w:lang w:val="es-ES"/>
+        </w:rPr>
+        <w:lastRenderedPageBreak/>
+        <w:t xml:space="preserve">El diseño según mi lógica deja ver que el movimiento, rotación, aparición de nueva pieza y game over, pueden apoyarse en la misma idea central, validar si una configuración tentativa cabe o no cabe. El desafío pide comparar bits de la pieza con bits del tablero y considerar fronteras. </w:t>
+      </w:r>
+    </w:p>
+    <w:p>
+      <w:pPr>
+        <w:ind w:left="360"/>
+        <w:rPr>
+          <w:lang w:val="es-ES"/>
+        </w:rPr>
+      </w:pPr>
+      <w:r>
+        <w:rPr>
+          <w:lang w:val="es-ES"/>
+        </w:rPr>
+        <w:t xml:space="preserve">Entonces unificare una validación para los: </w:t>
+      </w:r>
+    </w:p>
+    <w:p>
+      <w:pPr>
+        <w:pStyle w:val="Prrafodelista"/>
+        <w:numPr>
+          <w:ilvl w:val="0"/>
+          <w:numId w:val="11"/>
+        </w:numPr>
+        <w:rPr>
+          <w:lang w:val="es-ES"/>
+        </w:rPr>
+      </w:pPr>
+      <w:r>
+        <w:rPr>
+          <w:lang w:val="es-ES"/>
+        </w:rPr>
+        <w:t xml:space="preserve">Desplazamientos </w:t>
+      </w:r>
+    </w:p>
+    <w:p>
+      <w:pPr>
+        <w:pStyle w:val="Prrafodelista"/>
+        <w:numPr>
+          <w:ilvl w:val="0"/>
+          <w:numId w:val="11"/>
+        </w:numPr>
+        <w:rPr>
+          <w:lang w:val="es-ES"/>
+        </w:rPr>
+      </w:pPr>
+      <w:r>
+        <w:rPr>
+          <w:lang w:val="es-ES"/>
+        </w:rPr>
+        <w:t xml:space="preserve">Rotaciones </w:t>
+      </w:r>
+    </w:p>
+    <w:p>
+      <w:pPr>
+        <w:pStyle w:val="Prrafodelista"/>
+        <w:numPr>
+          <w:ilvl w:val="0"/>
+          <w:numId w:val="11"/>
+        </w:numPr>
+        <w:rPr>
+          <w:lang w:val="es-ES"/>
+        </w:rPr>
+      </w:pPr>
+      <w:r>
+        <w:rPr>
+          <w:lang w:val="es-ES"/>
+        </w:rPr>
+        <w:t xml:space="preserve">Descenso </w:t>
+      </w:r>
+    </w:p>
+    <w:p>
+      <w:pPr>
+        <w:pStyle w:val="Prrafodelista"/>
+        <w:numPr>
+          <w:ilvl w:val="0"/>
+          <w:numId w:val="11"/>
+        </w:numPr>
+        <w:rPr>
+          <w:lang w:val="es-ES"/>
+        </w:rPr>
+      </w:pPr>
+      <w:r>
+        <w:rPr>
+          <w:lang w:val="es-ES"/>
+        </w:rPr>
+        <w:t>Aparición de nuevas piezas</w:t>
+      </w:r>
+    </w:p>
+    <w:p>
+      <w:pPr>
+        <w:pStyle w:val="Prrafodelista"/>
+        <w:numPr>
+          <w:ilvl w:val="0"/>
+          <w:numId w:val="11"/>
+        </w:numPr>
+        <w:rPr>
+          <w:lang w:val="es-ES"/>
+        </w:rPr>
+      </w:pPr>
+      <w:r>
+        <w:rPr>
+          <w:lang w:val="es-ES"/>
+        </w:rPr>
+        <w:t xml:space="preserve">Detección de game over. </w:t>
+      </w:r>
+    </w:p>
+    <w:p>
+      <w:pPr>
+        <w:pStyle w:val="Prrafodelista"/>
+        <w:ind w:left="1080"/>
+        <w:rPr>
+          <w:lang w:val="es-ES"/>
+        </w:rPr>
+      </w:pPr>
+    </w:p>
+    <w:p>
+      <w:pPr>
+        <w:pStyle w:val="Prrafodelista"/>
+        <w:ind w:left="1080"/>
+        <w:rPr>
+          <w:lang w:val="es-ES"/>
+        </w:rPr>
+      </w:pPr>
+    </w:p>
+    <w:p>
+      <w:pPr>
+        <w:pStyle w:val="Prrafodelista"/>
+        <w:numPr>
+          <w:ilvl w:val="1"/>
+          <w:numId w:val="1"/>
+        </w:numPr>
+        <w:rPr>
+          <w:lang w:val="es-ES"/>
+        </w:rPr>
+      </w:pPr>
+      <w:r>
+        <w:rPr>
+          <w:lang w:val="es-ES"/>
+        </w:rPr>
+        <w:t xml:space="preserve">Limpieza de filas. </w:t>
+      </w:r>
+    </w:p>
+    <w:p>
+      <w:pPr>
+        <w:ind w:left="360"/>
+        <w:rPr>
+          <w:lang w:val="es-ES"/>
+        </w:rPr>
+      </w:pPr>
+      <w:r>
+        <w:rPr>
+          <w:lang w:val="es-ES"/>
+        </w:rPr>
+        <w:t>El desafío dice que cuando una fila tenga todos sus bits en 1 debe eliminarse y las superiores deben bajar, usando punteros y bits</w:t>
+      </w:r>
+    </w:p>
+    <w:p>
+      <w:pPr>
+        <w:ind w:left="360"/>
+        <w:rPr>
+          <w:lang w:val="es-ES"/>
+        </w:rPr>
+      </w:pPr>
+      <w:r>
+        <w:rPr>
+          <w:lang w:val="es-ES"/>
+        </w:rPr>
+        <w:t xml:space="preserve">La limpieza de filas la abordares sobra la representación binaria completa de cada fila, recorriendo desde </w:t>
+      </w:r>
+      <w:r>
+        <w:rPr>
+          <w:lang w:val="es-ES"/>
+        </w:rPr>
+        <w:t>la parte</w:t>
+      </w:r>
+      <w:r>
+        <w:rPr>
+          <w:lang w:val="es-ES"/>
+        </w:rPr>
+        <w:t xml:space="preserve"> inferior del tablero, para evitar inconsistencias cuando arias filas completas aparezcan seguidas. </w:t>
+      </w:r>
+    </w:p>
+    <w:p>
+      <w:pPr>
+        <w:ind w:left="360"/>
+        <w:rPr>
+          <w:lang w:val="es-ES"/>
+        </w:rPr>
+      </w:pPr>
+    </w:p>
+    <w:p>
+      <w:pPr>
+        <w:pStyle w:val="Prrafodelista"/>
+        <w:numPr>
+          <w:ilvl w:val="1"/>
+          <w:numId w:val="1"/>
+        </w:numPr>
+        <w:rPr>
+          <w:lang w:val="es-ES"/>
+        </w:rPr>
+      </w:pPr>
+      <w:r>
+        <w:rPr>
+          <w:lang w:val="es-ES"/>
+        </w:rPr>
+        <w:t xml:space="preserve">Impresión del tablero como representación de estados. </w:t>
+      </w:r>
+    </w:p>
+    <w:p>
+      <w:pPr>
+        <w:ind w:left="360"/>
+        <w:rPr>
+          <w:lang w:val="es-ES"/>
+        </w:rPr>
+      </w:pPr>
+      <w:r>
+        <w:rPr>
+          <w:lang w:val="es-ES"/>
+        </w:rPr>
+        <w:t>La visualización en consola de plantea como una representación discreta de estados del sistema, diferenciando claramente:</w:t>
+      </w:r>
+    </w:p>
+    <w:p>
+      <w:pPr>
+        <w:pStyle w:val="Prrafodelista"/>
+        <w:numPr>
+          <w:ilvl w:val="0"/>
+          <w:numId w:val="12"/>
+        </w:numPr>
+        <w:rPr>
+          <w:lang w:val="es-ES"/>
+        </w:rPr>
+      </w:pPr>
+      <w:r>
+        <w:rPr>
+          <w:lang w:val="es-ES"/>
+        </w:rPr>
+        <w:t xml:space="preserve">La representación interna de bits </w:t>
+      </w:r>
+    </w:p>
+    <w:p>
+      <w:pPr>
+        <w:pStyle w:val="Prrafodelista"/>
+        <w:numPr>
+          <w:ilvl w:val="0"/>
+          <w:numId w:val="12"/>
+        </w:numPr>
+        <w:rPr>
+          <w:lang w:val="es-ES"/>
+        </w:rPr>
+      </w:pPr>
+      <w:r>
+        <w:rPr>
+          <w:lang w:val="es-ES"/>
+        </w:rPr>
+        <w:t>La representación visible al usuario con símbolos “#” y “.”</w:t>
+      </w:r>
+    </w:p>
+    <w:p>
+      <w:pPr>
+        <w:pStyle w:val="Prrafodelista"/>
+        <w:ind w:left="1080"/>
+        <w:rPr>
+          <w:lang w:val="es-ES"/>
+        </w:rPr>
+      </w:pPr>
+    </w:p>
+    <w:p>
+      <w:pPr>
+        <w:pStyle w:val="Prrafodelista"/>
+        <w:numPr>
+          <w:ilvl w:val="1"/>
+          <w:numId w:val="1"/>
+        </w:numPr>
+        <w:rPr>
+          <w:lang w:val="es-ES"/>
+        </w:rPr>
+      </w:pPr>
+      <w:r>
+        <w:rPr>
+          <w:lang w:val="es-ES"/>
+        </w:rPr>
+        <w:t xml:space="preserve">Modularidad. </w:t>
+      </w:r>
+    </w:p>
+    <w:p>
+      <w:pPr>
+        <w:ind w:left="360"/>
+        <w:rPr>
+          <w:lang w:val="es-ES"/>
+        </w:rPr>
+      </w:pPr>
+      <w:r>
+        <w:rPr>
+          <w:lang w:val="es-ES"/>
+        </w:rPr>
+        <w:t xml:space="preserve">El desafío recomienda que la solución debe estar diseña con programación modular y multiactivo. </w:t>
+      </w:r>
+    </w:p>
+    <w:p>
+      <w:pPr>
+        <w:ind w:left="360"/>
+        <w:rPr>
+          <w:lang w:val="es-ES"/>
+        </w:rPr>
+      </w:pPr>
+      <w:r>
+        <w:rPr>
+          <w:lang w:val="es-ES"/>
+        </w:rPr>
+        <w:t xml:space="preserve">Esto permite: </w:t>
+      </w:r>
+    </w:p>
+    <w:p>
+      <w:pPr>
+        <w:pStyle w:val="Prrafodelista"/>
+        <w:numPr>
+          <w:ilvl w:val="0"/>
+          <w:numId w:val="13"/>
+        </w:numPr>
+        <w:rPr>
+          <w:lang w:val="es-ES"/>
+        </w:rPr>
+      </w:pPr>
+      <w:r>
+        <w:rPr>
+          <w:lang w:val="es-ES"/>
+        </w:rPr>
+        <w:t xml:space="preserve">Facilitar pruebas </w:t>
+      </w:r>
+    </w:p>
+    <w:p>
+      <w:pPr>
+        <w:pStyle w:val="Prrafodelista"/>
+        <w:numPr>
+          <w:ilvl w:val="0"/>
+          <w:numId w:val="13"/>
+        </w:numPr>
+        <w:rPr>
+          <w:lang w:val="es-ES"/>
+        </w:rPr>
+      </w:pPr>
+      <w:r>
+        <w:rPr>
+          <w:lang w:val="es-ES"/>
+        </w:rPr>
+        <w:t xml:space="preserve">Mantener el código legible </w:t>
+      </w:r>
+    </w:p>
+    <w:p>
+      <w:pPr>
+        <w:rPr>
+          <w:lang w:val="es-ES"/>
+        </w:rPr>
+      </w:pPr>
+    </w:p>
+    <w:p>
+      <w:pPr>
+        <w:rPr>
+          <w:lang w:val="es-ES"/>
+        </w:rPr>
+      </w:pPr>
     </w:p>
     <w:p>
       <w:pPr>
@@ -1356,14 +1968,12 @@
         <w:t>cpp</w:t>
       </w:r>
       <w:proofErr w:type="spellEnd"/>
-      <w:proofErr w:type="gramStart"/>
-      <w:r>
-        <w:rPr>
-          <w:lang w:val="es-ES"/>
-        </w:rPr>
-        <w:t>. :</w:t>
-      </w:r>
-      <w:proofErr w:type="gramEnd"/>
+      <w:r>
+        <w:rPr>
+          <w:lang w:val="es-ES"/>
+        </w:rPr>
+        <w:t>.:</w:t>
+      </w:r>
       <w:r>
         <w:rPr>
           <w:lang w:val="es-ES"/>
@@ -1393,7 +2003,13 @@
         <w:rPr>
           <w:lang w:val="es-ES"/>
         </w:rPr>
-        <w:t>Cpp</w:t>
+        <w:t>c</w:t>
+      </w:r>
+      <w:r>
+        <w:rPr>
+          <w:lang w:val="es-ES"/>
+        </w:rPr>
+        <w:t>pp</w:t>
       </w:r>
       <w:proofErr w:type="spellEnd"/>
       <w:r>
@@ -1446,14 +2062,12 @@
           <w:lang w:val="es-ES"/>
         </w:rPr>
       </w:pPr>
-      <w:proofErr w:type="gramStart"/>
-      <w:r>
-        <w:rPr>
-          <w:lang w:val="es-ES"/>
-        </w:rPr>
-        <w:t>Juego  .</w:t>
-      </w:r>
-      <w:proofErr w:type="gramEnd"/>
+      <w:r>
+        <w:rPr>
+          <w:lang w:val="es-ES"/>
+        </w:rPr>
+        <w:t>Juego .</w:t>
+      </w:r>
       <w:r>
         <w:rPr>
           <w:lang w:val="es-ES"/>
@@ -1497,8 +2111,56 @@
         <w:rPr>
           <w:lang w:val="es-ES"/>
         </w:rPr>
-        <w:t xml:space="preserve">Diseño del tablero </w:t>
-      </w:r>
+        <w:t>Diseño del tablero</w:t>
+      </w:r>
+      <w:r>
+        <w:rPr>
+          <w:lang w:val="es-ES"/>
+        </w:rPr>
+        <w:t>.</w:t>
+      </w:r>
+    </w:p>
+    <w:p>
+      <w:pPr>
+        <w:ind w:left="360"/>
+        <w:rPr>
+          <w:lang w:val="es-ES"/>
+        </w:rPr>
+      </w:pPr>
+      <w:r>
+        <w:rPr>
+          <w:lang w:val="es-ES"/>
+        </w:rPr>
+        <w:t>El tablero se modela como una estructura dinámica compuesta por fila</w:t>
+      </w:r>
+      <w:r>
+        <w:rPr>
+          <w:lang w:val="es-ES"/>
+        </w:rPr>
+        <w:t>s, donde cada fila se representa mediante un arreglo de bytes. Procedo así por que el ancho del tablero debe ser múltiplo de 8, lo que permite agrupar cada conjunto de 8 celdas dentro de un solo byte. De esta forma, el tablero puede almacenar su contenido de manera compacta y coherente con el uso de operaciones a nivel de bits, tal como exige el desafío.</w:t>
+      </w:r>
+    </w:p>
+    <w:p>
+      <w:pPr>
+        <w:ind w:left="360"/>
+        <w:rPr>
+          <w:lang w:val="es-ES"/>
+        </w:rPr>
+      </w:pPr>
+      <w:r>
+        <w:rPr>
+          <w:lang w:val="es-ES"/>
+        </w:rPr>
+        <w:t xml:space="preserve">A partir de esta decisión, cada fila del tablero tendrá una cantidad de bytes equivalente al ancho divido entre 8. Así, por ejemplo, un tablero de 16 columnas requería 2 bytes por fila mientras que un de 2 columnas requerirá 3 bytes por fila. </w:t>
+      </w:r>
+    </w:p>
+    <w:p>
+      <w:pPr>
+        <w:ind w:left="360"/>
+        <w:rPr>
+          <w:lang w:val="es-ES"/>
+        </w:rPr>
+      </w:pPr>
     </w:p>
     <w:p>
       <w:pPr>
@@ -1515,8 +2177,69 @@
         <w:rPr>
           <w:lang w:val="es-ES"/>
         </w:rPr>
-        <w:t xml:space="preserve">Diseño de piezas </w:t>
-      </w:r>
+        <w:t>Diseño de piezas</w:t>
+      </w:r>
+      <w:r>
+        <w:rPr>
+          <w:lang w:val="es-ES"/>
+        </w:rPr>
+        <w:t xml:space="preserve">. </w:t>
+      </w:r>
+    </w:p>
+    <w:p>
+      <w:pPr>
+        <w:ind w:left="360"/>
+        <w:rPr>
+          <w:lang w:val="es-ES"/>
+        </w:rPr>
+      </w:pPr>
+      <w:r>
+        <w:rPr>
+          <w:lang w:val="es-ES"/>
+        </w:rPr>
+        <w:t>La</w:t>
+      </w:r>
+      <w:r>
+        <w:rPr>
+          <w:lang w:val="es-ES"/>
+        </w:rPr>
+        <w:t>s piezas del juego se plantea dentro una caja local de 4x4. Esta elección se considera adecuada porque las figuras clásicas caben dentro de ese espacio, independientemente de su orientación. Trabajar con una caja uniforme permite tratar todas las piezas con la misma lógica y simplifica su rotación,</w:t>
+      </w:r>
+      <w:r>
+        <w:rPr>
+          <w:lang w:val="es-ES"/>
+        </w:rPr>
+        <w:t xml:space="preserve"> las colisiones y la proyección de la pieza sobre el tablero.  </w:t>
+      </w:r>
+    </w:p>
+    <w:p>
+      <w:pPr>
+        <w:ind w:left="360"/>
+        <w:rPr>
+          <w:lang w:val="es-ES"/>
+        </w:rPr>
+      </w:pPr>
+      <w:r>
+        <w:rPr>
+          <w:lang w:val="es-ES"/>
+        </w:rPr>
+        <w:t xml:space="preserve">Cada pieza se entiende como una forma local separad del tablero, y sus rotaciones pueden almacenarse como configuraciones previamente definidas. Esto evita calcular transformaciones geométricas complejas durante la ejecución y favorece una validación mas clara de movimientos y colisiones. </w:t>
+      </w:r>
+    </w:p>
+    <w:p>
+      <w:pPr>
+        <w:ind w:left="360"/>
+        <w:rPr>
+          <w:lang w:val="es-ES"/>
+        </w:rPr>
+      </w:pPr>
+    </w:p>
+    <w:p>
+      <w:pPr>
+        <w:rPr>
+          <w:lang w:val="es-ES"/>
+        </w:rPr>
+      </w:pPr>
     </w:p>
     <w:p>
       <w:pPr>
@@ -1533,7 +2256,62 @@
         <w:rPr>
           <w:lang w:val="es-ES"/>
         </w:rPr>
-        <w:t xml:space="preserve">Estado del juego </w:t>
+        <w:t>Estado del juego</w:t>
+      </w:r>
+    </w:p>
+    <w:p>
+      <w:pPr>
+        <w:ind w:left="360"/>
+        <w:rPr>
+          <w:lang w:val="es-ES"/>
+        </w:rPr>
+      </w:pPr>
+      <w:r>
+        <w:rPr>
+          <w:lang w:val="es-ES"/>
+        </w:rPr>
+        <w:t xml:space="preserve"> </w:t>
+      </w:r>
+      <w:r>
+        <w:rPr>
+          <w:lang w:val="es-ES"/>
+        </w:rPr>
+        <w:t xml:space="preserve">Para que el sistema funciones correctamente, es necesario mantener un conjunto mínimo de variables de estado durante toda la ejecución. Entre ellas se encuentran ancho y alto del tablero, la cantidad byte por fila. La estructura dinámica que almacena el tablero, el tipo de pieza </w:t>
+      </w:r>
+      <w:proofErr w:type="gramStart"/>
+      <w:r>
+        <w:rPr>
+          <w:lang w:val="es-ES"/>
+        </w:rPr>
+        <w:t>activa ,</w:t>
+      </w:r>
+      <w:proofErr w:type="gramEnd"/>
+      <w:r>
+        <w:rPr>
+          <w:lang w:val="es-ES"/>
+        </w:rPr>
+        <w:t xml:space="preserve"> la rotación actual, la fila y columna en las que se ubica dicha pieza, y una bandera que indique si la partida ha terminado. Estas variables </w:t>
+      </w:r>
+      <w:r>
+        <w:rPr>
+          <w:lang w:val="es-ES"/>
+        </w:rPr>
+        <w:lastRenderedPageBreak/>
+        <w:t>permiten controlar el comportamiento del juego sin mezclar elementos temporales con permanentes.</w:t>
+      </w:r>
+    </w:p>
+    <w:p>
+      <w:pPr>
+        <w:ind w:left="360"/>
+        <w:rPr>
+          <w:lang w:val="es-ES"/>
+        </w:rPr>
+      </w:pPr>
+      <w:r>
+        <w:rPr>
+          <w:lang w:val="es-ES"/>
+        </w:rPr>
+        <w:t xml:space="preserve">Dentro de este estado, se hace una distinción importante entre ele tablero fijo y la pieza activa. El tablero debe contener únicamente los bloques ya consolidados mientras que la pieza activa se mantiene como una entidad temporal que puede desplazare, rotarse y valides sin alterar directamente la estructura permanente. Solo cuando la pieza deja de poder descender, sus bits pasan a formar parte del tablero. Esa separación es calve para mantener la lógica del juego ordena y evitar inconsistencias durante la actualización de estados. </w:t>
       </w:r>
     </w:p>
     <w:p>
@@ -1556,6 +2334,52 @@
     </w:p>
     <w:p>
       <w:pPr>
+        <w:ind w:left="360"/>
+        <w:rPr>
+          <w:lang w:val="es-ES"/>
+        </w:rPr>
+      </w:pPr>
+      <w:r>
+        <w:rPr>
+          <w:lang w:val="es-ES"/>
+        </w:rPr>
+        <w:t>La validación de movimientos se plantea mediante la lógica de una simulación previa.</w:t>
+      </w:r>
+      <w:r>
+        <w:rPr>
+          <w:lang w:val="es-ES"/>
+        </w:rPr>
+        <w:t xml:space="preserve"> </w:t>
+      </w:r>
+      <w:r>
+        <w:rPr>
+          <w:lang w:val="es-ES"/>
+        </w:rPr>
+        <w:t xml:space="preserve">Esto significa </w:t>
+      </w:r>
+      <w:r>
+        <w:rPr>
+          <w:lang w:val="es-ES"/>
+        </w:rPr>
+        <w:t xml:space="preserve">que antes de mover o rotas una pieza, el sistema primero evalúa si la nueva configuración seria valida. Para ello, la pieza activa se proyecta sobre ele tablero usando una fila, una columna y una rotación tentativas. Una vez proyectada, se verifican dos condiciones fundamentes: que sus bits activos no salgan de las fronteras del tablero y que no coincidan con bits que estén ocupados por bloques fijos </w:t>
+      </w:r>
+    </w:p>
+    <w:p>
+      <w:pPr>
+        <w:ind w:left="360"/>
+        <w:rPr>
+          <w:lang w:val="es-ES"/>
+        </w:rPr>
+      </w:pPr>
+      <w:r>
+        <w:rPr>
+          <w:lang w:val="es-ES"/>
+        </w:rPr>
+        <w:t xml:space="preserve">Esto me da ventaja en el diseño reutilizando la misma lógica de validación en múltiples acciones del sistema. La verificación de desplazamientos hacia la izquierda o hacia la derecha, el descenso de la pieza, la rotación, la ubicación inicial de una pieza e incluso la condición de game over pueden resolverse a partir de la misma pregunta: si la pieza cabe o no en una configuración determinada. </w:t>
+      </w:r>
+    </w:p>
+    <w:p>
+      <w:pPr>
         <w:pStyle w:val="Prrafodelista"/>
         <w:numPr>
           <w:ilvl w:val="1"/>
@@ -1574,6 +2398,119 @@
     </w:p>
     <w:p>
       <w:pPr>
+        <w:ind w:left="360"/>
+        <w:rPr>
+          <w:lang w:val="es-ES"/>
+        </w:rPr>
+      </w:pPr>
+      <w:r>
+        <w:rPr>
+          <w:lang w:val="es-ES"/>
+        </w:rPr>
+        <w:t xml:space="preserve">La fijación de la pieza ocurre cuando esta ya no puede seguir descendiendo. En ese momento, deja de considerarse un elemento temporal y sus bits deben integrase al tablero permanente. Esa transición marca el cierre del turno de la pieza actual y permite que el tablero refleje de forma definitiva la nueva ocupación genera por el movimiento del jugador y la gravedad del turno. </w:t>
+      </w:r>
+    </w:p>
+    <w:p>
+      <w:pPr>
+        <w:ind w:left="360"/>
+        <w:rPr>
+          <w:lang w:val="es-ES"/>
+        </w:rPr>
+      </w:pPr>
+      <w:r>
+        <w:rPr>
+          <w:lang w:val="es-ES"/>
+        </w:rPr>
+        <w:t xml:space="preserve">Después de la fijación, el programa debe revisar si alguna fila quedo completamente ocupada. Una fila se considera llena cuando todos los bits que la representan se encuentran activos. Dado que el ancho del tablero es múltiplo de 8, esta comprobación puede hacerse revisando la totalidad de los bytes de la fila. Si una fila completa es detectada, debe eliminarse y las filas superiores deben descender una posición. Para que esta operación se consistente, conviene realizar el recorrido desde la parte inferior del tablero hacia arriba y si se elimina una fila, se debe reevaluar la misma </w:t>
+      </w:r>
+      <w:r>
+        <w:rPr>
+          <w:lang w:val="es-ES"/>
+        </w:rPr>
+        <w:t>posición</w:t>
+      </w:r>
+      <w:r>
+        <w:rPr>
+          <w:lang w:val="es-ES"/>
+        </w:rPr>
+        <w:t xml:space="preserve"> para </w:t>
+      </w:r>
+      <w:r>
+        <w:rPr>
+          <w:lang w:val="es-ES"/>
+        </w:rPr>
+        <w:t>detectar</w:t>
+      </w:r>
+      <w:r>
+        <w:rPr>
+          <w:lang w:val="es-ES"/>
+        </w:rPr>
+        <w:t xml:space="preserve"> </w:t>
+      </w:r>
+      <w:r>
+        <w:rPr>
+          <w:lang w:val="es-ES"/>
+        </w:rPr>
+        <w:t>posibles</w:t>
+      </w:r>
+      <w:r>
+        <w:rPr>
+          <w:lang w:val="es-ES"/>
+        </w:rPr>
+        <w:t xml:space="preserve"> filas consecutiva </w:t>
+      </w:r>
+      <w:r>
+        <w:rPr>
+          <w:lang w:val="es-ES"/>
+        </w:rPr>
+        <w:t>completas. esta parte del diseño se ajusta directamente al requisito del desafío, que exige limpieza</w:t>
+      </w:r>
+      <w:r>
+        <w:rPr>
+          <w:lang w:val="es-ES"/>
+        </w:rPr>
+        <w:t xml:space="preserve"> </w:t>
+      </w:r>
+      <w:r>
+        <w:rPr>
+          <w:lang w:val="es-ES"/>
+        </w:rPr>
+        <w:t>de filas mediante manipulación de puteros.</w:t>
+      </w:r>
+    </w:p>
+    <w:p>
+      <w:pPr>
+        <w:ind w:left="360"/>
+        <w:rPr>
+          <w:lang w:val="es-ES"/>
+        </w:rPr>
+      </w:pPr>
+    </w:p>
+    <w:p>
+      <w:pPr>
+        <w:ind w:left="360"/>
+        <w:rPr>
+          <w:lang w:val="es-ES"/>
+        </w:rPr>
+      </w:pPr>
+    </w:p>
+    <w:p>
+      <w:pPr>
+        <w:ind w:left="360"/>
+        <w:rPr>
+          <w:lang w:val="es-ES"/>
+        </w:rPr>
+      </w:pPr>
+    </w:p>
+    <w:p>
+      <w:pPr>
+        <w:rPr>
+          <w:lang w:val="es-ES"/>
+        </w:rPr>
+      </w:pPr>
+    </w:p>
+    <w:p>
+      <w:pPr>
         <w:rPr>
           <w:lang w:val="es-ES"/>
         </w:rPr>
@@ -1619,13 +2556,7 @@
         <w:rPr>
           <w:lang w:val="es-ES"/>
         </w:rPr>
-        <w:t xml:space="preserve">Etapa </w:t>
-      </w:r>
-      <w:r>
-        <w:rPr>
-          <w:lang w:val="es-ES"/>
-        </w:rPr>
-        <w:t>1. Comprensión del enunciado y análisis de restricciones</w:t>
+        <w:t>Etapa 1. Comprensión del enunciado y análisis de restricciones</w:t>
       </w:r>
     </w:p>
     <w:p>
@@ -1643,13 +2574,7 @@
         <w:rPr>
           <w:lang w:val="es-ES"/>
         </w:rPr>
-        <w:t>etapa</w:t>
-      </w:r>
-      <w:r>
-        <w:rPr>
-          <w:lang w:val="es-ES"/>
-        </w:rPr>
-        <w:t xml:space="preserve"> 2. Diseño de la representación del tablero</w:t>
+        <w:t>etapa 2. Diseño de la representación del tablero</w:t>
       </w:r>
     </w:p>
     <w:p>
@@ -1667,13 +2592,7 @@
         <w:rPr>
           <w:lang w:val="es-ES"/>
         </w:rPr>
-        <w:t>etapa</w:t>
-      </w:r>
-      <w:r>
-        <w:rPr>
-          <w:lang w:val="es-ES"/>
-        </w:rPr>
-        <w:t xml:space="preserve"> 3. Diseño de la representación de las piezas</w:t>
+        <w:t>etapa 3. Diseño de la representación de las piezas</w:t>
       </w:r>
     </w:p>
     <w:p>
@@ -1691,13 +2610,7 @@
         <w:rPr>
           <w:lang w:val="es-ES"/>
         </w:rPr>
-        <w:t>etapa</w:t>
-      </w:r>
-      <w:r>
-        <w:rPr>
-          <w:lang w:val="es-ES"/>
-        </w:rPr>
-        <w:t xml:space="preserve"> 4. Definición de la lógica de validación y colisiones</w:t>
+        <w:t>etapa 4. Definición de la lógica de validación y colisiones</w:t>
       </w:r>
     </w:p>
     <w:p>
@@ -1715,13 +2628,7 @@
         <w:rPr>
           <w:lang w:val="es-ES"/>
         </w:rPr>
-        <w:t>etapa</w:t>
-      </w:r>
-      <w:r>
-        <w:rPr>
-          <w:lang w:val="es-ES"/>
-        </w:rPr>
-        <w:t xml:space="preserve"> 5. Implementación del tablero y utilidades base</w:t>
+        <w:t>etapa 5. Implementación del tablero y utilidades base</w:t>
       </w:r>
     </w:p>
     <w:p>
@@ -1739,13 +2646,7 @@
         <w:rPr>
           <w:lang w:val="es-ES"/>
         </w:rPr>
-        <w:t>etapa</w:t>
-      </w:r>
-      <w:r>
-        <w:rPr>
-          <w:lang w:val="es-ES"/>
-        </w:rPr>
-        <w:t xml:space="preserve"> 6. Implementación de piezas y movimientos</w:t>
+        <w:t>etapa 6. Implementación de piezas y movimientos</w:t>
       </w:r>
     </w:p>
     <w:p>
@@ -1763,13 +2664,7 @@
         <w:rPr>
           <w:lang w:val="es-ES"/>
         </w:rPr>
-        <w:t>etapa</w:t>
-      </w:r>
-      <w:r>
-        <w:rPr>
-          <w:lang w:val="es-ES"/>
-        </w:rPr>
-        <w:t xml:space="preserve"> 7. Implementación de fijación, limpieza de filas y Game Over</w:t>
+        <w:t>etapa 7. Implementación de fijación, limpieza de filas y Game Over</w:t>
       </w:r>
     </w:p>
     <w:p>
@@ -1787,13 +2682,7 @@
         <w:rPr>
           <w:lang w:val="es-ES"/>
         </w:rPr>
-        <w:t xml:space="preserve">etapa </w:t>
-      </w:r>
-      <w:r>
-        <w:rPr>
-          <w:lang w:val="es-ES"/>
-        </w:rPr>
-        <w:t>8. Pruebas, depuración y ajustes</w:t>
+        <w:t>etapa 8. Pruebas, depuración y ajustes</w:t>
       </w:r>
     </w:p>
     <w:p>
@@ -1826,18 +2715,31 @@
         <w:pStyle w:val="Prrafodelista"/>
         <w:numPr>
           <w:ilvl w:val="0"/>
-          <w:numId w:val="1"/>
-        </w:numPr>
-        <w:rPr>
-          <w:lang w:val="es-ES"/>
-        </w:rPr>
-      </w:pPr>
-      <w:r>
-        <w:rPr>
-          <w:lang w:val="es-ES"/>
-        </w:rPr>
-        <w:lastRenderedPageBreak/>
-        <w:t>problemas identificados</w:t>
+          <w:numId w:val="10"/>
+        </w:numPr>
+        <w:rPr>
+          <w:lang w:val="es-ES"/>
+        </w:rPr>
+      </w:pPr>
+      <w:r>
+        <w:rPr>
+          <w:b/>
+          <w:bCs/>
+          <w:lang w:val="es-ES"/>
+        </w:rPr>
+        <w:t>validación de dimensiones del tablero:</w:t>
+      </w:r>
+      <w:r>
+        <w:rPr>
+          <w:lang w:val="es-ES"/>
+        </w:rPr>
+        <w:t xml:space="preserve"> </w:t>
+      </w:r>
+      <w:r>
+        <w:rPr>
+          <w:lang w:val="es-ES"/>
+        </w:rPr>
+        <w:t xml:space="preserve"> este va a cumplir la función de comprobar el ancho y el alto ingresados por el usuario sean al menos de 8 bloques y que el ancho, además, sea múltiplo de 8. </w:t>
       </w:r>
     </w:p>
     <w:p>
@@ -1848,15 +2750,173 @@
           <w:numId w:val="10"/>
         </w:numPr>
         <w:rPr>
-          <w:lang w:val="es-ES"/>
-        </w:rPr>
-      </w:pPr>
-      <w:r>
-        <w:t>decidir cómo separar pieza activa y tablero fijo</w:t>
-      </w:r>
-    </w:p>
-    <w:p>
-      <w:pPr>
+          <w:b/>
+          <w:bCs/>
+          <w:lang w:val="es-ES"/>
+        </w:rPr>
+      </w:pPr>
+      <w:r>
+        <w:rPr>
+          <w:b/>
+          <w:bCs/>
+          <w:lang w:val="es-ES"/>
+        </w:rPr>
+        <w:t>Inicialización de tablero</w:t>
+      </w:r>
+      <w:r>
+        <w:rPr>
+          <w:b/>
+          <w:bCs/>
+          <w:lang w:val="es-ES"/>
+        </w:rPr>
+        <w:t xml:space="preserve">: </w:t>
+      </w:r>
+      <w:r>
+        <w:rPr>
+          <w:lang w:val="es-ES"/>
+        </w:rPr>
+        <w:t xml:space="preserve">su función será reservar la memoria dinámica correspondiente y dejar todas las posiciones vacías al comenzar la partida </w:t>
+      </w:r>
+    </w:p>
+    <w:p>
+      <w:pPr>
+        <w:pStyle w:val="Prrafodelista"/>
+        <w:numPr>
+          <w:ilvl w:val="0"/>
+          <w:numId w:val="10"/>
+        </w:numPr>
+        <w:rPr>
+          <w:b/>
+          <w:bCs/>
+          <w:lang w:val="es-ES"/>
+        </w:rPr>
+      </w:pPr>
+      <w:r>
+        <w:rPr>
+          <w:b/>
+          <w:bCs/>
+          <w:lang w:val="es-ES"/>
+        </w:rPr>
+        <w:t xml:space="preserve">Impresión de tablero: </w:t>
+      </w:r>
+      <w:r>
+        <w:rPr>
+          <w:lang w:val="es-ES"/>
+        </w:rPr>
+        <w:t xml:space="preserve">se </w:t>
+      </w:r>
+      <w:r>
+        <w:rPr>
+          <w:lang w:val="es-ES"/>
+        </w:rPr>
+        <w:t>encargará</w:t>
+      </w:r>
+      <w:r>
+        <w:rPr>
+          <w:lang w:val="es-ES"/>
+        </w:rPr>
+        <w:t xml:space="preserve"> de traducir la representación compacta en bits hacia una salida visual comprensible para el usuario, usando símbolos que distingan celdas ocupadas y vacías. Esta parte es relevante porque el enunciado exige mostrar una </w:t>
+      </w:r>
+      <w:r>
+        <w:rPr>
+          <w:lang w:val="es-ES"/>
+        </w:rPr>
+        <w:t>representación</w:t>
+      </w:r>
+      <w:r>
+        <w:rPr>
+          <w:lang w:val="es-ES"/>
+        </w:rPr>
+        <w:t xml:space="preserve"> visual del tablero cada vez que su estado cambie </w:t>
+      </w:r>
+    </w:p>
+    <w:p>
+      <w:pPr>
+        <w:pStyle w:val="Prrafodelista"/>
+        <w:numPr>
+          <w:ilvl w:val="0"/>
+          <w:numId w:val="10"/>
+        </w:numPr>
+        <w:rPr>
+          <w:b/>
+          <w:bCs/>
+          <w:lang w:val="es-ES"/>
+        </w:rPr>
+      </w:pPr>
+      <w:r>
+        <w:rPr>
+          <w:b/>
+          <w:bCs/>
+          <w:lang w:val="es-ES"/>
+        </w:rPr>
+        <w:t xml:space="preserve">Generación de nuevas piezas: </w:t>
+      </w:r>
+      <w:r>
+        <w:rPr>
+          <w:lang w:val="es-ES"/>
+        </w:rPr>
+        <w:t xml:space="preserve">este deberá seleccionar de manera uniforme una forma del conjunto definido y ubicarla en la parte superior y centrada respecto al ancho del tablero. </w:t>
+      </w:r>
+    </w:p>
+    <w:p>
+      <w:pPr>
+        <w:pStyle w:val="Prrafodelista"/>
+        <w:numPr>
+          <w:ilvl w:val="0"/>
+          <w:numId w:val="10"/>
+        </w:numPr>
+        <w:rPr>
+          <w:b/>
+          <w:bCs/>
+          <w:lang w:val="es-ES"/>
+        </w:rPr>
+      </w:pPr>
+      <w:r>
+        <w:rPr>
+          <w:b/>
+          <w:bCs/>
+          <w:lang w:val="es-ES"/>
+        </w:rPr>
+        <w:t xml:space="preserve">Validación de posición: </w:t>
+      </w:r>
+      <w:r>
+        <w:rPr>
+          <w:lang w:val="es-ES"/>
+        </w:rPr>
+        <w:t xml:space="preserve">el cual se reutilizará para desplazamientos laterales, descenso, rotación, aparición de nuevas piezas y detección de game over. Este algoritmo constituye el núcleo lógico del programa. </w:t>
+      </w:r>
+    </w:p>
+    <w:p>
+      <w:pPr>
+        <w:pStyle w:val="Prrafodelista"/>
+        <w:numPr>
+          <w:ilvl w:val="0"/>
+          <w:numId w:val="10"/>
+        </w:numPr>
+        <w:rPr>
+          <w:b/>
+          <w:bCs/>
+          <w:lang w:val="es-ES"/>
+        </w:rPr>
+      </w:pPr>
+      <w:r>
+        <w:rPr>
+          <w:b/>
+          <w:bCs/>
+          <w:lang w:val="es-ES"/>
+        </w:rPr>
+        <w:t xml:space="preserve">Fijación de piezas, detección y eliminación de filas completas y control del juego por turnos: </w:t>
+      </w:r>
+      <w:r>
+        <w:rPr>
+          <w:lang w:val="es-ES"/>
+        </w:rPr>
+        <w:t xml:space="preserve">el algoritmo de fijación se activa cuando una pieza ya no puede seguir descendiendo y debe integrarse al tablero. El algoritmo de limpieza de filas revisa el contenido del tablero para identificas filas totalmente ocupadas y desplazar hacia abajo las superiores. Por su parte, el control del turno organiza la secuencia general del sistema: mostrar tablero, recibir acción, validar movimiento, aplicar gravedad por turno, fijar si corresponde, limpiar filas y generar una nueva pieza o declarar game over. </w:t>
+      </w:r>
+    </w:p>
+    <w:p>
+      <w:pPr>
+        <w:pStyle w:val="Prrafodelista"/>
         <w:rPr>
           <w:lang w:val="es-ES"/>
         </w:rPr>
@@ -1877,20 +2937,91 @@
         <w:rPr>
           <w:lang w:val="es-ES"/>
         </w:rPr>
+        <w:t>problemas identificados</w:t>
+      </w:r>
+    </w:p>
+    <w:p>
+      <w:pPr>
+        <w:pStyle w:val="Prrafodelista"/>
+      </w:pPr>
+      <w:r>
+        <w:lastRenderedPageBreak/>
+        <w:t xml:space="preserve">el desarrollo de esta fase preliminar ahonde mucho </w:t>
+      </w:r>
+      <w:r>
+        <w:t xml:space="preserve">en encontrar una representación del tablero compacta y eficiente, in recurrir a las matrices que ya conocía bien durante el curso de informática I en Python que son pesadas y que no estaban permitidas en este desafío, lo que me obligo a pensar en una lógica distinta de lo habitual apoyándome en lo que el desafío ya me recomienda o exige que es el uso de operadores a nivel de bits, memoria dinámica, punteros y selección responsables de tipos de datos. </w:t>
+      </w:r>
+    </w:p>
+    <w:p>
+      <w:pPr>
+        <w:pStyle w:val="Prrafodelista"/>
+      </w:pPr>
+    </w:p>
+    <w:p>
+      <w:pPr>
+        <w:pStyle w:val="Prrafodelista"/>
+        <w:rPr>
+          <w:lang w:val="es-ES"/>
+        </w:rPr>
+      </w:pPr>
+      <w:r>
+        <w:t xml:space="preserve">Otro reto fue definir la secuencia de eventos del juego. </w:t>
+      </w:r>
+      <w:r>
+        <w:t>A simple</w:t>
+      </w:r>
+      <w:r>
+        <w:t xml:space="preserve"> vista, la mecánica de tetris parece sencilla, pero al analizarla con mayor detalle fue necesario decidir en que momento se valida un movimiento, cuando se fija una pieza cuando se limpian la filas y en que instante debe generarse una nueva pieza o declarar el fin del juego </w:t>
+      </w:r>
+    </w:p>
+    <w:p>
+      <w:pPr>
+        <w:rPr>
+          <w:lang w:val="es-ES"/>
+        </w:rPr>
+      </w:pPr>
+    </w:p>
+    <w:p>
+      <w:pPr>
+        <w:pStyle w:val="Prrafodelista"/>
+        <w:numPr>
+          <w:ilvl w:val="0"/>
+          <w:numId w:val="1"/>
+        </w:numPr>
+        <w:rPr>
+          <w:lang w:val="es-ES"/>
+        </w:rPr>
+      </w:pPr>
+      <w:r>
+        <w:rPr>
+          <w:lang w:val="es-ES"/>
+        </w:rPr>
         <w:t xml:space="preserve">conclusiones preliminares </w:t>
       </w:r>
     </w:p>
     <w:p>
-      <w:pPr>
-        <w:rPr>
-          <w:lang w:val="es-ES"/>
-        </w:rPr>
-      </w:pPr>
       <w:r>
         <w:t>e</w:t>
       </w:r>
       <w:r>
-        <w:t>l análisis permitió identificar las restricciones críticas del problema, definir una alternativa de solución coherente con el uso de bits y memoria dinámica,</w:t>
+        <w:t xml:space="preserve">l análisis permitió identificar las restricciones críticas del </w:t>
+      </w:r>
+      <w:r>
+        <w:t>desafío, y su impacto sobre la propuesta de solución. A partir de ello, se definió una alternativa de diseño coherente con el uso de operaciones a nivel de bits, memori</w:t>
+      </w:r>
+      <w:r>
+        <w:t xml:space="preserve">a dinámica, punteros y programación modular. Entre las decisiones más importantes adoptadas tengo la representación del tablero, el modelado de piezas y las validaciones de movimientos y colisiones. </w:t>
+      </w:r>
+    </w:p>
+    <w:p/>
+    <w:p>
+      <w:pPr>
+        <w:rPr>
+          <w:lang w:val="es-ES"/>
+        </w:rPr>
+      </w:pPr>
+      <w:r>
+        <w:t xml:space="preserve">En términos de evolución, el proceso preliminar también permitió pasar de una compresión general del juego a una estructura de solución mucho mas precisa. Inicialmente, el problema podía interpretarse como una implementación simple de tetris por consola; sin embargo, el análisis detallo mostro que el verdadero reto se encuentra en representar de manera eficiente el tablero y las piezas, reutilizar una lógica común de validación y construir un motor por turnos claro, modular y sustentable. </w:t>
       </w:r>
     </w:p>
     <w:p>
@@ -2260,6 +3391,119 @@
     </w:lvl>
   </w:abstractNum>
   <w:abstractNum w:abstractNumId="3" w15:restartNumberingAfterBreak="0">
+    <w:nsid w:val="201D2E0A"/>
+    <w:multiLevelType w:val="hybridMultilevel"/>
+    <w:tmpl w:val="CD442788"/>
+    <w:lvl w:ilvl="0" w:tplc="240A0001">
+      <w:start w:val="1"/>
+      <w:numFmt w:val="bullet"/>
+      <w:lvlText w:val=""/>
+      <w:lvlJc w:val="left"/>
+      <w:pPr>
+        <w:ind w:left="1080" w:hanging="360"/>
+      </w:pPr>
+      <w:rPr>
+        <w:rFonts w:ascii="Symbol" w:hAnsi="Symbol" w:hint="default"/>
+      </w:rPr>
+    </w:lvl>
+    <w:lvl w:ilvl="1" w:tplc="240A0003" w:tentative="1">
+      <w:start w:val="1"/>
+      <w:numFmt w:val="bullet"/>
+      <w:lvlText w:val="o"/>
+      <w:lvlJc w:val="left"/>
+      <w:pPr>
+        <w:ind w:left="1800" w:hanging="360"/>
+      </w:pPr>
+      <w:rPr>
+        <w:rFonts w:ascii="Courier New" w:hAnsi="Courier New" w:cs="Courier New" w:hint="default"/>
+      </w:rPr>
+    </w:lvl>
+    <w:lvl w:ilvl="2" w:tplc="240A0005" w:tentative="1">
+      <w:start w:val="1"/>
+      <w:numFmt w:val="bullet"/>
+      <w:lvlText w:val=""/>
+      <w:lvlJc w:val="left"/>
+      <w:pPr>
+        <w:ind w:left="2520" w:hanging="360"/>
+      </w:pPr>
+      <w:rPr>
+        <w:rFonts w:ascii="Wingdings" w:hAnsi="Wingdings" w:hint="default"/>
+      </w:rPr>
+    </w:lvl>
+    <w:lvl w:ilvl="3" w:tplc="240A0001" w:tentative="1">
+      <w:start w:val="1"/>
+      <w:numFmt w:val="bullet"/>
+      <w:lvlText w:val=""/>
+      <w:lvlJc w:val="left"/>
+      <w:pPr>
+        <w:ind w:left="3240" w:hanging="360"/>
+      </w:pPr>
+      <w:rPr>
+        <w:rFonts w:ascii="Symbol" w:hAnsi="Symbol" w:hint="default"/>
+      </w:rPr>
+    </w:lvl>
+    <w:lvl w:ilvl="4" w:tplc="240A0003" w:tentative="1">
+      <w:start w:val="1"/>
+      <w:numFmt w:val="bullet"/>
+      <w:lvlText w:val="o"/>
+      <w:lvlJc w:val="left"/>
+      <w:pPr>
+        <w:ind w:left="3960" w:hanging="360"/>
+      </w:pPr>
+      <w:rPr>
+        <w:rFonts w:ascii="Courier New" w:hAnsi="Courier New" w:cs="Courier New" w:hint="default"/>
+      </w:rPr>
+    </w:lvl>
+    <w:lvl w:ilvl="5" w:tplc="240A0005" w:tentative="1">
+      <w:start w:val="1"/>
+      <w:numFmt w:val="bullet"/>
+      <w:lvlText w:val=""/>
+      <w:lvlJc w:val="left"/>
+      <w:pPr>
+        <w:ind w:left="4680" w:hanging="360"/>
+      </w:pPr>
+      <w:rPr>
+        <w:rFonts w:ascii="Wingdings" w:hAnsi="Wingdings" w:hint="default"/>
+      </w:rPr>
+    </w:lvl>
+    <w:lvl w:ilvl="6" w:tplc="240A0001" w:tentative="1">
+      <w:start w:val="1"/>
+      <w:numFmt w:val="bullet"/>
+      <w:lvlText w:val=""/>
+      <w:lvlJc w:val="left"/>
+      <w:pPr>
+        <w:ind w:left="5400" w:hanging="360"/>
+      </w:pPr>
+      <w:rPr>
+        <w:rFonts w:ascii="Symbol" w:hAnsi="Symbol" w:hint="default"/>
+      </w:rPr>
+    </w:lvl>
+    <w:lvl w:ilvl="7" w:tplc="240A0003" w:tentative="1">
+      <w:start w:val="1"/>
+      <w:numFmt w:val="bullet"/>
+      <w:lvlText w:val="o"/>
+      <w:lvlJc w:val="left"/>
+      <w:pPr>
+        <w:ind w:left="6120" w:hanging="360"/>
+      </w:pPr>
+      <w:rPr>
+        <w:rFonts w:ascii="Courier New" w:hAnsi="Courier New" w:cs="Courier New" w:hint="default"/>
+      </w:rPr>
+    </w:lvl>
+    <w:lvl w:ilvl="8" w:tplc="240A0005" w:tentative="1">
+      <w:start w:val="1"/>
+      <w:numFmt w:val="bullet"/>
+      <w:lvlText w:val=""/>
+      <w:lvlJc w:val="left"/>
+      <w:pPr>
+        <w:ind w:left="6840" w:hanging="360"/>
+      </w:pPr>
+      <w:rPr>
+        <w:rFonts w:ascii="Wingdings" w:hAnsi="Wingdings" w:hint="default"/>
+      </w:rPr>
+    </w:lvl>
+  </w:abstractNum>
+  <w:abstractNum w:abstractNumId="4" w15:restartNumberingAfterBreak="0">
     <w:nsid w:val="2F1A25C8"/>
     <w:multiLevelType w:val="hybridMultilevel"/>
     <w:tmpl w:val="4566DD34"/>
@@ -2372,7 +3616,7 @@
       </w:rPr>
     </w:lvl>
   </w:abstractNum>
-  <w:abstractNum w:abstractNumId="4" w15:restartNumberingAfterBreak="0">
+  <w:abstractNum w:abstractNumId="5" w15:restartNumberingAfterBreak="0">
     <w:nsid w:val="35B531EA"/>
     <w:multiLevelType w:val="hybridMultilevel"/>
     <w:tmpl w:val="10D4E2E2"/>
@@ -2485,7 +3729,120 @@
       </w:rPr>
     </w:lvl>
   </w:abstractNum>
-  <w:abstractNum w:abstractNumId="5" w15:restartNumberingAfterBreak="0">
+  <w:abstractNum w:abstractNumId="6" w15:restartNumberingAfterBreak="0">
+    <w:nsid w:val="36B8615B"/>
+    <w:multiLevelType w:val="hybridMultilevel"/>
+    <w:tmpl w:val="3752D37E"/>
+    <w:lvl w:ilvl="0" w:tplc="240A0001">
+      <w:start w:val="1"/>
+      <w:numFmt w:val="bullet"/>
+      <w:lvlText w:val=""/>
+      <w:lvlJc w:val="left"/>
+      <w:pPr>
+        <w:ind w:left="1080" w:hanging="360"/>
+      </w:pPr>
+      <w:rPr>
+        <w:rFonts w:ascii="Symbol" w:hAnsi="Symbol" w:hint="default"/>
+      </w:rPr>
+    </w:lvl>
+    <w:lvl w:ilvl="1" w:tplc="240A0003" w:tentative="1">
+      <w:start w:val="1"/>
+      <w:numFmt w:val="bullet"/>
+      <w:lvlText w:val="o"/>
+      <w:lvlJc w:val="left"/>
+      <w:pPr>
+        <w:ind w:left="1800" w:hanging="360"/>
+      </w:pPr>
+      <w:rPr>
+        <w:rFonts w:ascii="Courier New" w:hAnsi="Courier New" w:cs="Courier New" w:hint="default"/>
+      </w:rPr>
+    </w:lvl>
+    <w:lvl w:ilvl="2" w:tplc="240A0005" w:tentative="1">
+      <w:start w:val="1"/>
+      <w:numFmt w:val="bullet"/>
+      <w:lvlText w:val=""/>
+      <w:lvlJc w:val="left"/>
+      <w:pPr>
+        <w:ind w:left="2520" w:hanging="360"/>
+      </w:pPr>
+      <w:rPr>
+        <w:rFonts w:ascii="Wingdings" w:hAnsi="Wingdings" w:hint="default"/>
+      </w:rPr>
+    </w:lvl>
+    <w:lvl w:ilvl="3" w:tplc="240A0001" w:tentative="1">
+      <w:start w:val="1"/>
+      <w:numFmt w:val="bullet"/>
+      <w:lvlText w:val=""/>
+      <w:lvlJc w:val="left"/>
+      <w:pPr>
+        <w:ind w:left="3240" w:hanging="360"/>
+      </w:pPr>
+      <w:rPr>
+        <w:rFonts w:ascii="Symbol" w:hAnsi="Symbol" w:hint="default"/>
+      </w:rPr>
+    </w:lvl>
+    <w:lvl w:ilvl="4" w:tplc="240A0003" w:tentative="1">
+      <w:start w:val="1"/>
+      <w:numFmt w:val="bullet"/>
+      <w:lvlText w:val="o"/>
+      <w:lvlJc w:val="left"/>
+      <w:pPr>
+        <w:ind w:left="3960" w:hanging="360"/>
+      </w:pPr>
+      <w:rPr>
+        <w:rFonts w:ascii="Courier New" w:hAnsi="Courier New" w:cs="Courier New" w:hint="default"/>
+      </w:rPr>
+    </w:lvl>
+    <w:lvl w:ilvl="5" w:tplc="240A0005" w:tentative="1">
+      <w:start w:val="1"/>
+      <w:numFmt w:val="bullet"/>
+      <w:lvlText w:val=""/>
+      <w:lvlJc w:val="left"/>
+      <w:pPr>
+        <w:ind w:left="4680" w:hanging="360"/>
+      </w:pPr>
+      <w:rPr>
+        <w:rFonts w:ascii="Wingdings" w:hAnsi="Wingdings" w:hint="default"/>
+      </w:rPr>
+    </w:lvl>
+    <w:lvl w:ilvl="6" w:tplc="240A0001" w:tentative="1">
+      <w:start w:val="1"/>
+      <w:numFmt w:val="bullet"/>
+      <w:lvlText w:val=""/>
+      <w:lvlJc w:val="left"/>
+      <w:pPr>
+        <w:ind w:left="5400" w:hanging="360"/>
+      </w:pPr>
+      <w:rPr>
+        <w:rFonts w:ascii="Symbol" w:hAnsi="Symbol" w:hint="default"/>
+      </w:rPr>
+    </w:lvl>
+    <w:lvl w:ilvl="7" w:tplc="240A0003" w:tentative="1">
+      <w:start w:val="1"/>
+      <w:numFmt w:val="bullet"/>
+      <w:lvlText w:val="o"/>
+      <w:lvlJc w:val="left"/>
+      <w:pPr>
+        <w:ind w:left="6120" w:hanging="360"/>
+      </w:pPr>
+      <w:rPr>
+        <w:rFonts w:ascii="Courier New" w:hAnsi="Courier New" w:cs="Courier New" w:hint="default"/>
+      </w:rPr>
+    </w:lvl>
+    <w:lvl w:ilvl="8" w:tplc="240A0005" w:tentative="1">
+      <w:start w:val="1"/>
+      <w:numFmt w:val="bullet"/>
+      <w:lvlText w:val=""/>
+      <w:lvlJc w:val="left"/>
+      <w:pPr>
+        <w:ind w:left="6840" w:hanging="360"/>
+      </w:pPr>
+      <w:rPr>
+        <w:rFonts w:ascii="Wingdings" w:hAnsi="Wingdings" w:hint="default"/>
+      </w:rPr>
+    </w:lvl>
+  </w:abstractNum>
+  <w:abstractNum w:abstractNumId="7" w15:restartNumberingAfterBreak="0">
     <w:nsid w:val="48E3785B"/>
     <w:multiLevelType w:val="hybridMultilevel"/>
     <w:tmpl w:val="8B5A5D18"/>
@@ -2598,7 +3955,120 @@
       </w:rPr>
     </w:lvl>
   </w:abstractNum>
-  <w:abstractNum w:abstractNumId="6" w15:restartNumberingAfterBreak="0">
+  <w:abstractNum w:abstractNumId="8" w15:restartNumberingAfterBreak="0">
+    <w:nsid w:val="53CF6DDC"/>
+    <w:multiLevelType w:val="hybridMultilevel"/>
+    <w:tmpl w:val="BD54B666"/>
+    <w:lvl w:ilvl="0" w:tplc="240A0001">
+      <w:start w:val="1"/>
+      <w:numFmt w:val="bullet"/>
+      <w:lvlText w:val=""/>
+      <w:lvlJc w:val="left"/>
+      <w:pPr>
+        <w:ind w:left="1080" w:hanging="360"/>
+      </w:pPr>
+      <w:rPr>
+        <w:rFonts w:ascii="Symbol" w:hAnsi="Symbol" w:hint="default"/>
+      </w:rPr>
+    </w:lvl>
+    <w:lvl w:ilvl="1" w:tplc="240A0003" w:tentative="1">
+      <w:start w:val="1"/>
+      <w:numFmt w:val="bullet"/>
+      <w:lvlText w:val="o"/>
+      <w:lvlJc w:val="left"/>
+      <w:pPr>
+        <w:ind w:left="1800" w:hanging="360"/>
+      </w:pPr>
+      <w:rPr>
+        <w:rFonts w:ascii="Courier New" w:hAnsi="Courier New" w:cs="Courier New" w:hint="default"/>
+      </w:rPr>
+    </w:lvl>
+    <w:lvl w:ilvl="2" w:tplc="240A0005" w:tentative="1">
+      <w:start w:val="1"/>
+      <w:numFmt w:val="bullet"/>
+      <w:lvlText w:val=""/>
+      <w:lvlJc w:val="left"/>
+      <w:pPr>
+        <w:ind w:left="2520" w:hanging="360"/>
+      </w:pPr>
+      <w:rPr>
+        <w:rFonts w:ascii="Wingdings" w:hAnsi="Wingdings" w:hint="default"/>
+      </w:rPr>
+    </w:lvl>
+    <w:lvl w:ilvl="3" w:tplc="240A0001" w:tentative="1">
+      <w:start w:val="1"/>
+      <w:numFmt w:val="bullet"/>
+      <w:lvlText w:val=""/>
+      <w:lvlJc w:val="left"/>
+      <w:pPr>
+        <w:ind w:left="3240" w:hanging="360"/>
+      </w:pPr>
+      <w:rPr>
+        <w:rFonts w:ascii="Symbol" w:hAnsi="Symbol" w:hint="default"/>
+      </w:rPr>
+    </w:lvl>
+    <w:lvl w:ilvl="4" w:tplc="240A0003" w:tentative="1">
+      <w:start w:val="1"/>
+      <w:numFmt w:val="bullet"/>
+      <w:lvlText w:val="o"/>
+      <w:lvlJc w:val="left"/>
+      <w:pPr>
+        <w:ind w:left="3960" w:hanging="360"/>
+      </w:pPr>
+      <w:rPr>
+        <w:rFonts w:ascii="Courier New" w:hAnsi="Courier New" w:cs="Courier New" w:hint="default"/>
+      </w:rPr>
+    </w:lvl>
+    <w:lvl w:ilvl="5" w:tplc="240A0005" w:tentative="1">
+      <w:start w:val="1"/>
+      <w:numFmt w:val="bullet"/>
+      <w:lvlText w:val=""/>
+      <w:lvlJc w:val="left"/>
+      <w:pPr>
+        <w:ind w:left="4680" w:hanging="360"/>
+      </w:pPr>
+      <w:rPr>
+        <w:rFonts w:ascii="Wingdings" w:hAnsi="Wingdings" w:hint="default"/>
+      </w:rPr>
+    </w:lvl>
+    <w:lvl w:ilvl="6" w:tplc="240A0001" w:tentative="1">
+      <w:start w:val="1"/>
+      <w:numFmt w:val="bullet"/>
+      <w:lvlText w:val=""/>
+      <w:lvlJc w:val="left"/>
+      <w:pPr>
+        <w:ind w:left="5400" w:hanging="360"/>
+      </w:pPr>
+      <w:rPr>
+        <w:rFonts w:ascii="Symbol" w:hAnsi="Symbol" w:hint="default"/>
+      </w:rPr>
+    </w:lvl>
+    <w:lvl w:ilvl="7" w:tplc="240A0003" w:tentative="1">
+      <w:start w:val="1"/>
+      <w:numFmt w:val="bullet"/>
+      <w:lvlText w:val="o"/>
+      <w:lvlJc w:val="left"/>
+      <w:pPr>
+        <w:ind w:left="6120" w:hanging="360"/>
+      </w:pPr>
+      <w:rPr>
+        <w:rFonts w:ascii="Courier New" w:hAnsi="Courier New" w:cs="Courier New" w:hint="default"/>
+      </w:rPr>
+    </w:lvl>
+    <w:lvl w:ilvl="8" w:tplc="240A0005" w:tentative="1">
+      <w:start w:val="1"/>
+      <w:numFmt w:val="bullet"/>
+      <w:lvlText w:val=""/>
+      <w:lvlJc w:val="left"/>
+      <w:pPr>
+        <w:ind w:left="6840" w:hanging="360"/>
+      </w:pPr>
+      <w:rPr>
+        <w:rFonts w:ascii="Wingdings" w:hAnsi="Wingdings" w:hint="default"/>
+      </w:rPr>
+    </w:lvl>
+  </w:abstractNum>
+  <w:abstractNum w:abstractNumId="9" w15:restartNumberingAfterBreak="0">
     <w:nsid w:val="5CC361DB"/>
     <w:multiLevelType w:val="hybridMultilevel"/>
     <w:tmpl w:val="F43E76D6"/>
@@ -2711,7 +4181,7 @@
       </w:rPr>
     </w:lvl>
   </w:abstractNum>
-  <w:abstractNum w:abstractNumId="7" w15:restartNumberingAfterBreak="0">
+  <w:abstractNum w:abstractNumId="10" w15:restartNumberingAfterBreak="0">
     <w:nsid w:val="60B251E6"/>
     <w:multiLevelType w:val="multilevel"/>
     <w:tmpl w:val="6ECE4A8A"/>
@@ -2824,7 +4294,7 @@
       </w:rPr>
     </w:lvl>
   </w:abstractNum>
-  <w:abstractNum w:abstractNumId="8" w15:restartNumberingAfterBreak="0">
+  <w:abstractNum w:abstractNumId="11" w15:restartNumberingAfterBreak="0">
     <w:nsid w:val="6B100694"/>
     <w:multiLevelType w:val="multilevel"/>
     <w:tmpl w:val="8FD0ABFC"/>
@@ -2945,7 +4415,7 @@
       </w:rPr>
     </w:lvl>
   </w:abstractNum>
-  <w:abstractNum w:abstractNumId="9" w15:restartNumberingAfterBreak="0">
+  <w:abstractNum w:abstractNumId="12" w15:restartNumberingAfterBreak="0">
     <w:nsid w:val="6DCD2A41"/>
     <w:multiLevelType w:val="hybridMultilevel"/>
     <w:tmpl w:val="537E6794"/>
@@ -3059,10 +4529,10 @@
     </w:lvl>
   </w:abstractNum>
   <w:num w:numId="1" w16cid:durableId="566502518">
-    <w:abstractNumId w:val="8"/>
+    <w:abstractNumId w:val="11"/>
   </w:num>
   <w:num w:numId="2" w16cid:durableId="640310979">
-    <w:abstractNumId w:val="3"/>
+    <w:abstractNumId w:val="4"/>
   </w:num>
   <w:num w:numId="3" w16cid:durableId="95174096">
     <w:abstractNumId w:val="1"/>
@@ -3071,21 +4541,30 @@
     <w:abstractNumId w:val="0"/>
   </w:num>
   <w:num w:numId="5" w16cid:durableId="1275289757">
-    <w:abstractNumId w:val="4"/>
+    <w:abstractNumId w:val="5"/>
   </w:num>
   <w:num w:numId="6" w16cid:durableId="1529837028">
-    <w:abstractNumId w:val="9"/>
+    <w:abstractNumId w:val="12"/>
   </w:num>
   <w:num w:numId="7" w16cid:durableId="66810317">
     <w:abstractNumId w:val="2"/>
   </w:num>
   <w:num w:numId="8" w16cid:durableId="1946032555">
+    <w:abstractNumId w:val="10"/>
+  </w:num>
+  <w:num w:numId="9" w16cid:durableId="301234602">
     <w:abstractNumId w:val="7"/>
   </w:num>
-  <w:num w:numId="9" w16cid:durableId="301234602">
-    <w:abstractNumId w:val="5"/>
+  <w:num w:numId="10" w16cid:durableId="1031568447">
+    <w:abstractNumId w:val="9"/>
   </w:num>
-  <w:num w:numId="10" w16cid:durableId="1031568447">
+  <w:num w:numId="11" w16cid:durableId="1285961635">
+    <w:abstractNumId w:val="3"/>
+  </w:num>
+  <w:num w:numId="12" w16cid:durableId="427891201">
+    <w:abstractNumId w:val="8"/>
+  </w:num>
+  <w:num w:numId="13" w16cid:durableId="1949967743">
     <w:abstractNumId w:val="6"/>
   </w:num>
 </w:numbering>
@@ -3694,6 +5173,7 @@
   <w:style w:type="character" w:default="1" w:styleId="Fuentedeprrafopredeter">
     <w:name w:val="Default Paragraph Font"/>
     <w:uiPriority w:val="1"/>
+    <w:semiHidden/>
     <w:unhideWhenUsed/>
   </w:style>
   <w:style w:type="table" w:default="1" w:styleId="Tablanormal">

</xml_diff>